<commit_message>
Pakiet 3: rejestr i zakres zgodne z potwierdzonym zakresem po lekcji 3
Dodane reguły dla pustego okresu i statusów z zerem, CANCELLED tylko
w podziale na statusy, otwarte kwestie jako decyzje zespołu technicznego.

Co-Authored-By: Claude Opus 5.5 <noreply@anthropic.com>
Claude-Session: https://claude.ai/code/session_013ZAHXaNmfgzQq3snLwVkTj
</commit_message>
<xml_diff>
--- a/docs/pakiety/Pakiet_STUDENT_Lekcja_3_Szymankiewicz_34562.docx
+++ b/docs/pakiety/Pakiet_STUDENT_Lekcja_3_Szymankiewicz_34562.docx
@@ -20,34 +20,14 @@
       <w:pPr>
         <w:spacing w:after="240"/>
       </w:pPr>
-      <w:proofErr w:type="spellStart"/>
       <w:r>
         <w:rPr>
           <w:color w:val="4A5D7E"/>
           <w:sz w:val="26"/>
           <w:szCs w:val="26"/>
         </w:rPr>
-        <w:t>Refinement</w:t>
-      </w:r>
-      <w:proofErr w:type="spellEnd"/>
-      <w:r>
-        <w:rPr>
-          <w:color w:val="4A5D7E"/>
-          <w:sz w:val="26"/>
-          <w:szCs w:val="26"/>
-        </w:rPr>
-        <w:t xml:space="preserve"> z Product </w:t>
-      </w:r>
-      <w:proofErr w:type="spellStart"/>
-      <w:r>
-        <w:rPr>
-          <w:color w:val="4A5D7E"/>
-          <w:sz w:val="26"/>
-          <w:szCs w:val="26"/>
-        </w:rPr>
-        <w:t>Ownerem</w:t>
-      </w:r>
-      <w:proofErr w:type="spellEnd"/>
+        <w:t xml:space="preserve">Refinement z Product Ownerem</w:t>
+      </w:r>
     </w:p>
     <w:p>
       <w:pPr>
@@ -82,69 +62,12 @@
           <w:lang w:val="en-US"/>
         </w:rPr>
       </w:pPr>
-      <w:proofErr w:type="spellStart"/>
       <w:r>
         <w:rPr>
           <w:color w:val="595959"/>
           <w:lang w:val="en-US"/>
         </w:rPr>
-        <w:t>Repozytorium</w:t>
-      </w:r>
-      <w:proofErr w:type="spellEnd"/>
-      <w:r>
-        <w:rPr>
-          <w:color w:val="595959"/>
-          <w:lang w:val="en-US"/>
-        </w:rPr>
-        <w:t>: github.com/</w:t>
-      </w:r>
-      <w:proofErr w:type="spellStart"/>
-      <w:r>
-        <w:rPr>
-          <w:color w:val="595959"/>
-          <w:lang w:val="en-US"/>
-        </w:rPr>
-        <w:t>cewa</w:t>
-      </w:r>
-      <w:proofErr w:type="spellEnd"/>
-      <w:r>
-        <w:rPr>
-          <w:color w:val="595959"/>
-          <w:lang w:val="en-US"/>
-        </w:rPr>
-        <w:t>-stack/</w:t>
-      </w:r>
-      <w:proofErr w:type="spellStart"/>
-      <w:r>
-        <w:rPr>
-          <w:color w:val="595959"/>
-          <w:lang w:val="en-US"/>
-        </w:rPr>
-        <w:t>orderflow</w:t>
-      </w:r>
-      <w:proofErr w:type="spellEnd"/>
-      <w:r>
-        <w:rPr>
-          <w:color w:val="595959"/>
-          <w:lang w:val="en-US"/>
-        </w:rPr>
-        <w:t xml:space="preserve">, </w:t>
-      </w:r>
-      <w:proofErr w:type="spellStart"/>
-      <w:r>
-        <w:rPr>
-          <w:color w:val="595959"/>
-          <w:lang w:val="en-US"/>
-        </w:rPr>
-        <w:t>gałąź</w:t>
-      </w:r>
-      <w:proofErr w:type="spellEnd"/>
-      <w:r>
-        <w:rPr>
-          <w:color w:val="595959"/>
-          <w:lang w:val="en-US"/>
-        </w:rPr>
-        <w:t xml:space="preserve"> feature/order-reporting</w:t>
+        <w:t xml:space="preserve">Repozytorium: github.com/cewa-stack/orderflow, gałąź feature/order-reporting</w:t>
       </w:r>
     </w:p>
     <w:p>
@@ -185,55 +108,7 @@
           <w:sz w:val="18"/>
           <w:szCs w:val="18"/>
         </w:rPr>
-        <w:t xml:space="preserve">Product </w:t>
-      </w:r>
-      <w:proofErr w:type="spellStart"/>
-      <w:r>
-        <w:rPr>
-          <w:sz w:val="18"/>
-          <w:szCs w:val="18"/>
-        </w:rPr>
-        <w:t>Owner</w:t>
-      </w:r>
-      <w:proofErr w:type="spellEnd"/>
-      <w:r>
-        <w:rPr>
-          <w:sz w:val="18"/>
-          <w:szCs w:val="18"/>
-        </w:rPr>
-        <w:t xml:space="preserve">: </w:t>
-      </w:r>
-      <w:r>
-        <w:rPr>
-          <w:sz w:val="18"/>
-          <w:szCs w:val="18"/>
-        </w:rPr>
-        <w:t xml:space="preserve">Łukasz Szymankiewicz                                                                                     </w:t>
-      </w:r>
-      <w:proofErr w:type="spellStart"/>
-      <w:proofErr w:type="gramStart"/>
-      <w:r>
-        <w:rPr>
-          <w:sz w:val="18"/>
-          <w:szCs w:val="18"/>
-        </w:rPr>
-        <w:t>Facylitator:Analityk</w:t>
-      </w:r>
-      <w:proofErr w:type="gramEnd"/>
-      <w:r>
-        <w:rPr>
-          <w:sz w:val="18"/>
-          <w:szCs w:val="18"/>
-        </w:rPr>
-        <w:t>:Sekretarz</w:t>
-      </w:r>
-      <w:proofErr w:type="spellEnd"/>
-      <w:r>
-        <w:rPr>
-          <w:sz w:val="18"/>
-          <w:szCs w:val="18"/>
-        </w:rPr>
-        <w:t>: Łukasz Szymankiewicz</w:t>
+        <w:t xml:space="preserve">Product Owner: Łukasz Szymankiewicz                                                                                     Facylitator:Analityk:Sekretarz: Łukasz Szymankiewicz</w:t>
       </w:r>
     </w:p>
     <w:tbl>
@@ -562,7 +437,7 @@
                 <w:sz w:val="17"/>
                 <w:szCs w:val="17"/>
               </w:rPr>
-              <w:t>CANCELLED liczone w liczbie wszystkich zamówień i w podziale na statusy; wykluczone z wartości sprzedaży; osobno liczba i wartość anulowanych.</w:t>
+              <w:t xml:space="preserve">CANCELLED liczone w liczbie wszystkich zamówień i widoczne w podziale na statusy (liczba i wartość); wykluczone z wartości sprzedaży.</w:t>
             </w:r>
           </w:p>
         </w:tc>
@@ -588,7 +463,7 @@
                 <w:sz w:val="17"/>
                 <w:szCs w:val="17"/>
               </w:rPr>
-              <w:t>AC dla podsumowania: dwie wartości - sprzedaż (bez CANCELLED) i anulowane.</w:t>
+              <w:t xml:space="preserve">AC dla podsumowania: wartość sprzedaży bez CANCELLED; CANCELLED widoczne w podziale na statusy.</w:t>
             </w:r>
           </w:p>
         </w:tc>
@@ -902,23 +777,7 @@
                 <w:sz w:val="17"/>
                 <w:szCs w:val="17"/>
               </w:rPr>
-              <w:t xml:space="preserve">Wartość sprzedaży = suma </w:t>
-            </w:r>
-            <w:proofErr w:type="spellStart"/>
-            <w:r>
-              <w:rPr>
-                <w:sz w:val="17"/>
-                <w:szCs w:val="17"/>
-              </w:rPr>
-              <w:t>total</w:t>
-            </w:r>
-            <w:proofErr w:type="spellEnd"/>
-            <w:r>
-              <w:rPr>
-                <w:sz w:val="17"/>
-                <w:szCs w:val="17"/>
-              </w:rPr>
-              <w:t xml:space="preserve"> zamówień o statusach NEW, PAID, PROCESSING, SHIPPED, DELIVERED.</w:t>
+              <w:t xml:space="preserve">Wartość sprzedaży = suma total zamówień o statusach NEW, PAID, PROCESSING, SHIPPED, DELIVERED.</w:t>
             </w:r>
           </w:p>
         </w:tc>
@@ -1089,7 +948,7 @@
                 <w:sz w:val="17"/>
                 <w:szCs w:val="17"/>
               </w:rPr>
-              <w:t>Podział na statusy według statusu w chwili generowania; raport pokazuje datę i godzinę wygenerowania.</w:t>
+              <w:t xml:space="preserve">Podział na statusy według bieżącego statusu zamówienia w chwili raportowania, bez historii zmian.</w:t>
             </w:r>
           </w:p>
         </w:tc>
@@ -1116,7 +975,7 @@
                 <w:sz w:val="17"/>
                 <w:szCs w:val="17"/>
               </w:rPr>
-              <w:t>Historia statusów poza zakresem; AC: wynik powtarzalny przy niezmienionych danych.</w:t>
+              <w:t xml:space="preserve">Historia statusów i raport statusu na wskazany dzień poza zakresem; AC: wynik powtarzalny przy niezmienionych danych.</w:t>
             </w:r>
           </w:p>
         </w:tc>
@@ -1258,7 +1117,7 @@
                 <w:sz w:val="17"/>
                 <w:szCs w:val="17"/>
               </w:rPr>
-              <w:t>Rekord z brakującą/niepoprawną datą, statusem lub wartością w danych -&gt; raport nie powstaje; komunikat wskazuje ID zamówienia.</w:t>
+              <w:t xml:space="preserve">Rekord z brakującą/niepoprawną datą, statusem lub wartością w danych -&gt; raport nie powstaje, bez częściowego wyniku; komunikat wskazuje ID zamówienia.</w:t>
             </w:r>
           </w:p>
         </w:tc>
@@ -1429,7 +1288,7 @@
                 <w:sz w:val="17"/>
                 <w:szCs w:val="17"/>
               </w:rPr>
-              <w:t>Daty wpisywane jako RRRR-MM-DD; zły format, nieistniejąca data lub koniec przed początkiem -&gt; komunikat z przykładem poprawnej wartości, brak raportu.</w:t>
+              <w:t xml:space="preserve">Dwie wymagane daty kalendarzowe RRRR-MM-DD; brak daty, zły format, nieistniejąca data lub koniec przed początkiem -&gt; komunikat z przykładem poprawnej wartości, brak raportu. Bez dodatkowych limitów długości okresu.</w:t>
             </w:r>
           </w:p>
         </w:tc>
@@ -1483,7 +1342,7 @@
                 <w:sz w:val="17"/>
                 <w:szCs w:val="17"/>
               </w:rPr>
-              <w:t>Ograniczenia zakresu - otwarte.</w:t>
+              <w:t xml:space="preserve">-</w:t>
             </w:r>
           </w:p>
         </w:tc>
@@ -1655,6 +1514,346 @@
           </w:p>
         </w:tc>
       </w:tr>
+      <w:tr>
+        <w:tblPrEx>
+          <w:tblCellMar>
+            <w:top w:w="0" w:type="dxa"/>
+            <w:bottom w:w="0" w:type="dxa"/>
+          </w:tblCellMar>
+        </w:tblPrEx>
+        <w:trPr>
+          <w:cantSplit/>
+        </w:trPr>
+        <w:tc>
+          <w:tcPr>
+            <w:tcW w:w="450" w:type="dxa"/>
+            <w:tcBorders>
+              <w:top w:val="single" w:sz="4" w:space="0" w:color="D9D9D9"/>
+              <w:left w:val="single" w:sz="4" w:space="0" w:color="D9D9D9"/>
+              <w:bottom w:val="single" w:sz="4" w:space="0" w:color="D9D9D9"/>
+              <w:right w:val="single" w:sz="4" w:space="0" w:color="D9D9D9"/>
+            </w:tcBorders>
+            <w:shd w:val="clear" w:color="auto" w:fill="EEF2F6"/>
+            <w:tcMar>
+              <w:top w:w="60" w:type="dxa"/>
+              <w:left w:w="100" w:type="dxa"/>
+              <w:bottom w:w="60" w:type="dxa"/>
+              <w:right w:w="100" w:type="dxa"/>
+            </w:tcMar>
+          </w:tcPr>
+          <w:p>
+            <w:r>
+              <w:rPr>
+                <w:sz w:val="17"/>
+                <w:szCs w:val="17"/>
+              </w:rPr>
+              <w:t xml:space="preserve">8</w:t>
+            </w:r>
+          </w:p>
+        </w:tc>
+        <w:tc>
+          <w:tcPr>
+            <w:tcW w:w="1500" w:type="dxa"/>
+            <w:tcBorders>
+              <w:top w:val="single" w:sz="4" w:space="0" w:color="D9D9D9"/>
+              <w:left w:val="single" w:sz="4" w:space="0" w:color="D9D9D9"/>
+              <w:bottom w:val="single" w:sz="4" w:space="0" w:color="D9D9D9"/>
+              <w:right w:val="single" w:sz="4" w:space="0" w:color="D9D9D9"/>
+            </w:tcBorders>
+            <w:shd w:val="clear" w:color="auto" w:fill="EEF2F6"/>
+            <w:tcMar>
+              <w:top w:w="60" w:type="dxa"/>
+              <w:left w:w="100" w:type="dxa"/>
+              <w:bottom w:w="60" w:type="dxa"/>
+              <w:right w:w="100" w:type="dxa"/>
+            </w:tcMar>
+          </w:tcPr>
+          <w:p>
+            <w:r>
+              <w:rPr>
+                <w:sz w:val="17"/>
+                <w:szCs w:val="17"/>
+              </w:rPr>
+              <w:t xml:space="preserve">Pusty okres: jak pokazać wynik?</w:t>
+            </w:r>
+          </w:p>
+        </w:tc>
+        <w:tc>
+          <w:tcPr>
+            <w:tcW w:w="1900" w:type="dxa"/>
+            <w:tcBorders>
+              <w:top w:val="single" w:sz="4" w:space="0" w:color="D9D9D9"/>
+              <w:left w:val="single" w:sz="4" w:space="0" w:color="D9D9D9"/>
+              <w:bottom w:val="single" w:sz="4" w:space="0" w:color="D9D9D9"/>
+              <w:right w:val="single" w:sz="4" w:space="0" w:color="D9D9D9"/>
+            </w:tcBorders>
+            <w:shd w:val="clear" w:color="auto" w:fill="EEF2F6"/>
+            <w:tcMar>
+              <w:top w:w="60" w:type="dxa"/>
+              <w:left w:w="100" w:type="dxa"/>
+              <w:bottom w:w="60" w:type="dxa"/>
+              <w:right w:w="100" w:type="dxa"/>
+            </w:tcMar>
+          </w:tcPr>
+          <w:p>
+            <w:r>
+              <w:rPr>
+                <w:sz w:val="17"/>
+                <w:szCs w:val="17"/>
+              </w:rPr>
+              <w:t xml:space="preserve">To nie błąd, użytkownik ma dostać jasną informację.</w:t>
+            </w:r>
+          </w:p>
+        </w:tc>
+        <w:tc>
+          <w:tcPr>
+            <w:tcW w:w="2450" w:type="dxa"/>
+            <w:tcBorders>
+              <w:top w:val="single" w:sz="4" w:space="0" w:color="D9D9D9"/>
+              <w:left w:val="single" w:sz="4" w:space="0" w:color="D9D9D9"/>
+              <w:bottom w:val="single" w:sz="4" w:space="0" w:color="D9D9D9"/>
+              <w:right w:val="single" w:sz="4" w:space="0" w:color="D9D9D9"/>
+            </w:tcBorders>
+            <w:shd w:val="clear" w:color="auto" w:fill="EEF2F6"/>
+            <w:tcMar>
+              <w:top w:w="60" w:type="dxa"/>
+              <w:left w:w="100" w:type="dxa"/>
+              <w:bottom w:w="60" w:type="dxa"/>
+              <w:right w:w="100" w:type="dxa"/>
+            </w:tcMar>
+          </w:tcPr>
+          <w:p>
+            <w:r>
+              <w:rPr>
+                <w:sz w:val="17"/>
+                <w:szCs w:val="17"/>
+              </w:rPr>
+              <w:t xml:space="preserve">Poprawny zakres bez zamówień -&gt; czytelny wynik: 0 zamówień, wartość sprzedaży 0.00 zł, wszystkie statusy z zerem i informacja, że w okresie nie ma zamówień.</w:t>
+            </w:r>
+          </w:p>
+        </w:tc>
+        <w:tc>
+          <w:tcPr>
+            <w:tcW w:w="1800" w:type="dxa"/>
+            <w:tcBorders>
+              <w:top w:val="single" w:sz="4" w:space="0" w:color="D9D9D9"/>
+              <w:left w:val="single" w:sz="4" w:space="0" w:color="D9D9D9"/>
+              <w:bottom w:val="single" w:sz="4" w:space="0" w:color="D9D9D9"/>
+              <w:right w:val="single" w:sz="4" w:space="0" w:color="D9D9D9"/>
+            </w:tcBorders>
+            <w:shd w:val="clear" w:color="auto" w:fill="EEF2F6"/>
+            <w:tcMar>
+              <w:top w:w="60" w:type="dxa"/>
+              <w:left w:w="100" w:type="dxa"/>
+              <w:bottom w:w="60" w:type="dxa"/>
+              <w:right w:w="100" w:type="dxa"/>
+            </w:tcMar>
+          </w:tcPr>
+          <w:p>
+            <w:r>
+              <w:rPr>
+                <w:sz w:val="17"/>
+                <w:szCs w:val="17"/>
+              </w:rPr>
+              <w:t xml:space="preserve">AC dla przypadku 3.</w:t>
+            </w:r>
+          </w:p>
+        </w:tc>
+        <w:tc>
+          <w:tcPr>
+            <w:tcW w:w="1538" w:type="dxa"/>
+            <w:tcBorders>
+              <w:top w:val="single" w:sz="4" w:space="0" w:color="D9D9D9"/>
+              <w:left w:val="single" w:sz="4" w:space="0" w:color="D9D9D9"/>
+              <w:bottom w:val="single" w:sz="4" w:space="0" w:color="D9D9D9"/>
+              <w:right w:val="single" w:sz="4" w:space="0" w:color="D9D9D9"/>
+            </w:tcBorders>
+            <w:shd w:val="clear" w:color="auto" w:fill="EEF2F6"/>
+            <w:tcMar>
+              <w:top w:w="60" w:type="dxa"/>
+              <w:left w:w="100" w:type="dxa"/>
+              <w:bottom w:w="60" w:type="dxa"/>
+              <w:right w:w="100" w:type="dxa"/>
+            </w:tcMar>
+          </w:tcPr>
+          <w:p>
+            <w:r>
+              <w:rPr>
+                <w:sz w:val="17"/>
+                <w:szCs w:val="17"/>
+              </w:rPr>
+              <w:t xml:space="preserve">-</w:t>
+            </w:r>
+          </w:p>
+        </w:tc>
+      </w:tr>
+      <w:tr>
+        <w:tblPrEx>
+          <w:tblCellMar>
+            <w:top w:w="0" w:type="dxa"/>
+            <w:bottom w:w="0" w:type="dxa"/>
+          </w:tblCellMar>
+        </w:tblPrEx>
+        <w:trPr>
+          <w:cantSplit/>
+        </w:trPr>
+        <w:tc>
+          <w:tcPr>
+            <w:tcW w:w="450" w:type="dxa"/>
+            <w:tcBorders>
+              <w:top w:val="single" w:sz="4" w:space="0" w:color="D9D9D9"/>
+              <w:left w:val="single" w:sz="4" w:space="0" w:color="D9D9D9"/>
+              <w:bottom w:val="single" w:sz="4" w:space="0" w:color="D9D9D9"/>
+              <w:right w:val="single" w:sz="4" w:space="0" w:color="D9D9D9"/>
+            </w:tcBorders>
+            <w:tcMar>
+              <w:top w:w="60" w:type="dxa"/>
+              <w:left w:w="100" w:type="dxa"/>
+              <w:bottom w:w="60" w:type="dxa"/>
+              <w:right w:w="100" w:type="dxa"/>
+            </w:tcMar>
+          </w:tcPr>
+          <w:p>
+            <w:r>
+              <w:rPr>
+                <w:sz w:val="17"/>
+                <w:szCs w:val="17"/>
+              </w:rPr>
+              <w:t xml:space="preserve">9</w:t>
+            </w:r>
+          </w:p>
+        </w:tc>
+        <w:tc>
+          <w:tcPr>
+            <w:tcW w:w="1500" w:type="dxa"/>
+            <w:tcBorders>
+              <w:top w:val="single" w:sz="4" w:space="0" w:color="D9D9D9"/>
+              <w:left w:val="single" w:sz="4" w:space="0" w:color="D9D9D9"/>
+              <w:bottom w:val="single" w:sz="4" w:space="0" w:color="D9D9D9"/>
+              <w:right w:val="single" w:sz="4" w:space="0" w:color="D9D9D9"/>
+            </w:tcBorders>
+            <w:tcMar>
+              <w:top w:w="60" w:type="dxa"/>
+              <w:left w:w="100" w:type="dxa"/>
+              <w:bottom w:w="60" w:type="dxa"/>
+              <w:right w:w="100" w:type="dxa"/>
+            </w:tcMar>
+          </w:tcPr>
+          <w:p>
+            <w:r>
+              <w:rPr>
+                <w:sz w:val="17"/>
+                <w:szCs w:val="17"/>
+              </w:rPr>
+              <w:t xml:space="preserve">Podział na statusy: wszystkie czy tylko występujące?</w:t>
+            </w:r>
+          </w:p>
+        </w:tc>
+        <w:tc>
+          <w:tcPr>
+            <w:tcW w:w="1900" w:type="dxa"/>
+            <w:tcBorders>
+              <w:top w:val="single" w:sz="4" w:space="0" w:color="D9D9D9"/>
+              <w:left w:val="single" w:sz="4" w:space="0" w:color="D9D9D9"/>
+              <w:bottom w:val="single" w:sz="4" w:space="0" w:color="D9D9D9"/>
+              <w:right w:val="single" w:sz="4" w:space="0" w:color="D9D9D9"/>
+            </w:tcBorders>
+            <w:tcMar>
+              <w:top w:w="60" w:type="dxa"/>
+              <w:left w:w="100" w:type="dxa"/>
+              <w:bottom w:w="60" w:type="dxa"/>
+              <w:right w:w="100" w:type="dxa"/>
+            </w:tcMar>
+          </w:tcPr>
+          <w:p>
+            <w:r>
+              <w:rPr>
+                <w:sz w:val="17"/>
+                <w:szCs w:val="17"/>
+              </w:rPr>
+              <w:t xml:space="preserve">Wszystkie znane statusy, także z wynikiem zero.</w:t>
+            </w:r>
+          </w:p>
+        </w:tc>
+        <w:tc>
+          <w:tcPr>
+            <w:tcW w:w="2450" w:type="dxa"/>
+            <w:tcBorders>
+              <w:top w:val="single" w:sz="4" w:space="0" w:color="D9D9D9"/>
+              <w:left w:val="single" w:sz="4" w:space="0" w:color="D9D9D9"/>
+              <w:bottom w:val="single" w:sz="4" w:space="0" w:color="D9D9D9"/>
+              <w:right w:val="single" w:sz="4" w:space="0" w:color="D9D9D9"/>
+            </w:tcBorders>
+            <w:tcMar>
+              <w:top w:w="60" w:type="dxa"/>
+              <w:left w:w="100" w:type="dxa"/>
+              <w:bottom w:w="60" w:type="dxa"/>
+              <w:right w:w="100" w:type="dxa"/>
+            </w:tcMar>
+          </w:tcPr>
+          <w:p>
+            <w:r>
+              <w:rPr>
+                <w:sz w:val="17"/>
+                <w:szCs w:val="17"/>
+              </w:rPr>
+              <w:t xml:space="preserve">Raport zawsze pokazuje 6 statusów (NEW, PAID, PROCESSING, SHIPPED, DELIVERED, CANCELLED) z liczbą i wartością, także gdy wynik to 0.</w:t>
+            </w:r>
+          </w:p>
+        </w:tc>
+        <w:tc>
+          <w:tcPr>
+            <w:tcW w:w="1800" w:type="dxa"/>
+            <w:tcBorders>
+              <w:top w:val="single" w:sz="4" w:space="0" w:color="D9D9D9"/>
+              <w:left w:val="single" w:sz="4" w:space="0" w:color="D9D9D9"/>
+              <w:bottom w:val="single" w:sz="4" w:space="0" w:color="D9D9D9"/>
+              <w:right w:val="single" w:sz="4" w:space="0" w:color="D9D9D9"/>
+            </w:tcBorders>
+            <w:tcMar>
+              <w:top w:w="60" w:type="dxa"/>
+              <w:left w:w="100" w:type="dxa"/>
+              <w:bottom w:w="60" w:type="dxa"/>
+              <w:right w:w="100" w:type="dxa"/>
+            </w:tcMar>
+          </w:tcPr>
+          <w:p>
+            <w:r>
+              <w:rPr>
+                <w:sz w:val="17"/>
+                <w:szCs w:val="17"/>
+              </w:rPr>
+              <w:t xml:space="preserve">Stały układ wyniku; AC dla podziału na statusy.</w:t>
+            </w:r>
+          </w:p>
+        </w:tc>
+        <w:tc>
+          <w:tcPr>
+            <w:tcW w:w="1538" w:type="dxa"/>
+            <w:tcBorders>
+              <w:top w:val="single" w:sz="4" w:space="0" w:color="D9D9D9"/>
+              <w:left w:val="single" w:sz="4" w:space="0" w:color="D9D9D9"/>
+              <w:bottom w:val="single" w:sz="4" w:space="0" w:color="D9D9D9"/>
+              <w:right w:val="single" w:sz="4" w:space="0" w:color="D9D9D9"/>
+            </w:tcBorders>
+            <w:tcMar>
+              <w:top w:w="60" w:type="dxa"/>
+              <w:left w:w="100" w:type="dxa"/>
+              <w:bottom w:w="60" w:type="dxa"/>
+              <w:right w:w="100" w:type="dxa"/>
+            </w:tcMar>
+          </w:tcPr>
+          <w:p>
+            <w:r>
+              <w:rPr>
+                <w:sz w:val="17"/>
+                <w:szCs w:val="17"/>
+              </w:rPr>
+              <w:t xml:space="preserve">-</w:t>
+            </w:r>
+          </w:p>
+        </w:tc>
+      </w:tr>
     </w:tbl>
     <w:p>
       <w:pPr>
@@ -1673,6 +1872,7 @@
     </w:p>
     <w:p>
       <w:pPr>
+        <w:keepNext/>
         <w:pStyle w:val="Akapitzlist"/>
         <w:numPr>
           <w:ilvl w:val="0"/>
@@ -1690,6 +1890,7 @@
     </w:p>
     <w:p>
       <w:pPr>
+        <w:keepNext/>
         <w:pStyle w:val="Akapitzlist"/>
         <w:numPr>
           <w:ilvl w:val="0"/>
@@ -1707,6 +1908,7 @@
     </w:p>
     <w:p>
       <w:pPr>
+        <w:keepNext/>
         <w:pStyle w:val="Akapitzlist"/>
         <w:numPr>
           <w:ilvl w:val="0"/>
@@ -1737,11 +1939,6 @@
           <w:szCs w:val="18"/>
         </w:rPr>
         <w:t>[x] Każda niewiadoma ma właściciela i następny krok</w:t>
-      </w:r>
-    </w:p>
-    <w:p>
-      <w:r>
-        <w:br w:type="page"/>
       </w:r>
     </w:p>
     <w:p>
@@ -1785,7 +1982,7 @@
         <w:spacing w:after="60"/>
       </w:pPr>
       <w:r>
-        <w:t>Nowa operacja w menu: raport okresowy z datą początkową i końcową (RRRR-MM-DD, oba dni włącznie).</w:t>
+        <w:t xml:space="preserve">Osobny raport okresowy uruchamiany z aplikacji konsolowej (nowa operacja w menu).</w:t>
       </w:r>
     </w:p>
     <w:p>
@@ -1798,7 +1995,7 @@
         <w:spacing w:after="60"/>
       </w:pPr>
       <w:r>
-        <w:t>Walidacja zakresu: format, istniejąca data, data początkowa &lt;= końcowa; czytelny komunikat, brak raportu przy błędzie.</w:t>
+        <w:t xml:space="preserve">Dwie wymagane daty kalendarzowe w formacie RRRR-MM-DD.</w:t>
       </w:r>
     </w:p>
     <w:p>
@@ -1811,15 +2008,7 @@
         <w:spacing w:after="60"/>
       </w:pPr>
       <w:r>
-        <w:t>Wybór zamówień po dacie utworzenia (</w:t>
-      </w:r>
-      <w:proofErr w:type="spellStart"/>
-      <w:r>
-        <w:t>created_at</w:t>
-      </w:r>
-      <w:proofErr w:type="spellEnd"/>
-      <w:r>
-        <w:t>); każde zamówienie najwyżej raz.</w:t>
+        <w:t xml:space="preserve">Obustronnie domknięty zakres oparty na created_at (od 00:00:00 pierwszego dnia do 23:59:59 ostatniego).</w:t>
       </w:r>
     </w:p>
     <w:p>
@@ -1832,7 +2021,7 @@
         <w:spacing w:after="60"/>
       </w:pPr>
       <w:r>
-        <w:t>Wynik: okres i data wygenerowania, liczba wszystkich zamówień, wartość sprzedaży (bez CANCELLED), liczba i wartość anulowanych, liczba i wartość dla każdego statusu.</w:t>
+        <w:t xml:space="preserve">Liczba wszystkich zamówień oraz wartość sprzedaży bez CANCELLED.</w:t>
       </w:r>
     </w:p>
     <w:p>
@@ -1845,7 +2034,7 @@
         <w:spacing w:after="60"/>
       </w:pPr>
       <w:r>
-        <w:t>Jednoznaczny komunikat dla okresu bez zamówień; obsługa niespójnych rekordów bez pozornie poprawnego wyniku.</w:t>
+        <w:t xml:space="preserve">Liczba i wartość dla wszystkich znanych statusów, także z wynikiem zero.</w:t>
       </w:r>
     </w:p>
     <w:p>
@@ -1858,7 +2047,46 @@
         <w:spacing w:after="60"/>
       </w:pPr>
       <w:r>
-        <w:t>Raport nie modyfikuje danych; dotychczasowe funkcje i obecny raport działają bez zmian.</w:t>
+        <w:t xml:space="preserve">Bieżący status zamówienia w chwili raportowania.</w:t>
+      </w:r>
+    </w:p>
+    <w:p>
+      <w:pPr>
+        <w:pStyle w:val="Akapitzlist"/>
+        <w:numPr>
+          <w:ilvl w:val="0"/>
+          <w:numId w:val="2"/>
+        </w:numPr>
+        <w:spacing w:after="60"/>
+      </w:pPr>
+      <w:r>
+        <w:t xml:space="preserve">Czytelny wynik dla pustego okresu.</w:t>
+      </w:r>
+    </w:p>
+    <w:p>
+      <w:pPr>
+        <w:pStyle w:val="Akapitzlist"/>
+        <w:numPr>
+          <w:ilvl w:val="0"/>
+          <w:numId w:val="2"/>
+        </w:numPr>
+        <w:spacing w:after="60"/>
+      </w:pPr>
+      <w:r>
+        <w:t xml:space="preserve">Odrzucenie błędnego zakresu i niespójnych danych bez częściowego raportu.</w:t>
+      </w:r>
+    </w:p>
+    <w:p>
+      <w:pPr>
+        <w:pStyle w:val="Akapitzlist"/>
+        <w:numPr>
+          <w:ilvl w:val="0"/>
+          <w:numId w:val="2"/>
+        </w:numPr>
+        <w:spacing w:after="60"/>
+      </w:pPr>
+      <w:r>
+        <w:t xml:space="preserve">Zachowanie dotychczasowego raportu wszystkich zamówień; raport nie modyfikuje danych.</w:t>
       </w:r>
     </w:p>
     <w:p>
@@ -1886,7 +2114,7 @@
         <w:spacing w:after="60"/>
       </w:pPr>
       <w:r>
-        <w:t>Panel analityczny, wykresy, porównywanie wielu okresów, prognozy (BR pkt 15).</w:t>
+        <w:t xml:space="preserve">Panel graficzny, wykresy, dashboard i porównanie wielu okresów.</w:t>
       </w:r>
     </w:p>
     <w:p>
@@ -1899,7 +2127,7 @@
         <w:spacing w:after="60"/>
       </w:pPr>
       <w:r>
-        <w:t>Integracje (BI, księgowość, płatności), wysyłka e-mail, eksport do pliku.</w:t>
+        <w:t xml:space="preserve">Eksport do CSV, PDF albo automatyczna wysyłka.</w:t>
       </w:r>
     </w:p>
     <w:p>
@@ -1912,7 +2140,7 @@
         <w:spacing w:after="60"/>
       </w:pPr>
       <w:r>
-        <w:t>Historia statusów i przebudowa modelu danych, nowy system ról i uprawnień.</w:t>
+        <w:t xml:space="preserve">Integracje z BI, księgowością i operatorem płatności.</w:t>
       </w:r>
     </w:p>
     <w:p>
@@ -1925,7 +2153,33 @@
         <w:spacing w:after="60"/>
       </w:pPr>
       <w:r>
-        <w:t>Skróty okresów (dziś, wczoraj, bieżący miesiąc) oraz filtrowanie po kliencie, produkcie, płatności lub dostawie.</w:t>
+        <w:t xml:space="preserve">Historia zmian statusu oraz raport statusu na wskazany dzień.</w:t>
+      </w:r>
+    </w:p>
+    <w:p>
+      <w:pPr>
+        <w:pStyle w:val="Akapitzlist"/>
+        <w:numPr>
+          <w:ilvl w:val="0"/>
+          <w:numId w:val="2"/>
+        </w:numPr>
+        <w:spacing w:after="60"/>
+      </w:pPr>
+      <w:r>
+        <w:t xml:space="preserve">Przebudowa modelu danych, ról i uprawnień.</w:t>
+      </w:r>
+    </w:p>
+    <w:p>
+      <w:pPr>
+        <w:pStyle w:val="Akapitzlist"/>
+        <w:numPr>
+          <w:ilvl w:val="0"/>
+          <w:numId w:val="2"/>
+        </w:numPr>
+        <w:spacing w:after="60"/>
+      </w:pPr>
+      <w:r>
+        <w:t xml:space="preserve">Prognozowanie sprzedaży i nowe miary analityczne.</w:t>
       </w:r>
     </w:p>
     <w:p>
@@ -2129,7 +2383,7 @@
                 <w:sz w:val="17"/>
                 <w:szCs w:val="17"/>
               </w:rPr>
-              <w:t>Czy przy anulowanych pokazywać ich numery ID, żeby na odprawie dało się je szybko sprawdzić?</w:t>
+              <w:t xml:space="preserve">Strefa czasu dla created_at (zapis bez strefy, czas lokalny komputera).</w:t>
             </w:r>
           </w:p>
         </w:tc>
@@ -2155,7 +2409,7 @@
                 <w:sz w:val="17"/>
                 <w:szCs w:val="17"/>
               </w:rPr>
-              <w:t>Zmienia zawartość wyniku i AC dla przypadku 4.</w:t>
+              <w:t xml:space="preserve">Może przesunąć zamówienia z okolic północy między dniami.</w:t>
             </w:r>
           </w:p>
         </w:tc>
@@ -2181,17 +2435,8 @@
                 <w:sz w:val="17"/>
                 <w:szCs w:val="17"/>
               </w:rPr>
-              <w:t xml:space="preserve">Product </w:t>
-            </w:r>
-            <w:proofErr w:type="spellStart"/>
-            <w:r>
-              <w:rPr>
-                <w:sz w:val="17"/>
-                <w:szCs w:val="17"/>
-              </w:rPr>
-              <w:t>Owner</w:t>
-            </w:r>
-            <w:proofErr w:type="spellEnd"/>
+              <w:t xml:space="preserve">Zespół techniczny</w:t>
+            </w:r>
           </w:p>
         </w:tc>
         <w:tc>
@@ -2216,7 +2461,7 @@
                 <w:sz w:val="17"/>
                 <w:szCs w:val="17"/>
               </w:rPr>
-              <w:t>Decyzja przed lekcją 4 (User Story i AC)</w:t>
+              <w:t xml:space="preserve">Ustalić przed AC dla granic okresu (lekcja 4)</w:t>
             </w:r>
           </w:p>
         </w:tc>
@@ -2254,7 +2499,7 @@
                 <w:sz w:val="17"/>
                 <w:szCs w:val="17"/>
               </w:rPr>
-              <w:t>Ograniczenia zakresu: data w przyszłości, maksymalna długość okresu.</w:t>
+              <w:t xml:space="preserve">Sposób parsowania dat i rodzaje wyjątków.</w:t>
             </w:r>
           </w:p>
         </w:tc>
@@ -2281,7 +2526,7 @@
                 <w:sz w:val="17"/>
                 <w:szCs w:val="17"/>
               </w:rPr>
-              <w:t>Bez reguły AC walidacji jest niejednoznaczne.</w:t>
+              <w:t xml:space="preserve">Potrzebne do testów walidacji zakresu.</w:t>
             </w:r>
           </w:p>
         </w:tc>
@@ -2308,17 +2553,8 @@
                 <w:sz w:val="17"/>
                 <w:szCs w:val="17"/>
               </w:rPr>
-              <w:t xml:space="preserve">Product </w:t>
-            </w:r>
-            <w:proofErr w:type="spellStart"/>
-            <w:r>
-              <w:rPr>
-                <w:sz w:val="17"/>
-                <w:szCs w:val="17"/>
-              </w:rPr>
-              <w:t>Owner</w:t>
-            </w:r>
-            <w:proofErr w:type="spellEnd"/>
+              <w:t xml:space="preserve">Zespół techniczny</w:t>
+            </w:r>
           </w:p>
         </w:tc>
         <w:tc>
@@ -2344,7 +2580,7 @@
                 <w:sz w:val="17"/>
                 <w:szCs w:val="17"/>
               </w:rPr>
-              <w:t>Decyzja przed lekcją 4</w:t>
+              <w:t xml:space="preserve">Decyzja przy implementacji, po lekcji 4</w:t>
             </w:r>
           </w:p>
         </w:tc>
@@ -2381,23 +2617,7 @@
                 <w:sz w:val="17"/>
                 <w:szCs w:val="17"/>
               </w:rPr>
-              <w:t xml:space="preserve">Strefa czasu: </w:t>
-            </w:r>
-            <w:proofErr w:type="spellStart"/>
-            <w:r>
-              <w:rPr>
-                <w:sz w:val="17"/>
-                <w:szCs w:val="17"/>
-              </w:rPr>
-              <w:t>created_at</w:t>
-            </w:r>
-            <w:proofErr w:type="spellEnd"/>
-            <w:r>
-              <w:rPr>
-                <w:sz w:val="17"/>
-                <w:szCs w:val="17"/>
-              </w:rPr>
-              <w:t xml:space="preserve"> bez strefy, czas lokalny komputera.</w:t>
+              <w:t xml:space="preserve">Układ wyniku w konsoli, numer opcji menu i format kwot.</w:t>
             </w:r>
           </w:p>
         </w:tc>
@@ -2423,7 +2643,7 @@
                 <w:sz w:val="17"/>
                 <w:szCs w:val="17"/>
               </w:rPr>
-              <w:t>Może przesunąć zamówienia z okolic północy między dniami.</w:t>
+              <w:t xml:space="preserve">Wpływa na czytelność wyniku na odprawach (pkt 10).</w:t>
             </w:r>
           </w:p>
         </w:tc>
@@ -2449,7 +2669,7 @@
                 <w:sz w:val="17"/>
                 <w:szCs w:val="17"/>
               </w:rPr>
-              <w:t>Zespół + PO</w:t>
+              <w:t xml:space="preserve">Zespół techniczny</w:t>
             </w:r>
           </w:p>
         </w:tc>
@@ -2475,23 +2695,7 @@
                 <w:sz w:val="17"/>
                 <w:szCs w:val="17"/>
               </w:rPr>
-              <w:t>Potwierdzić: czas lokalny firmy (Europe/</w:t>
-            </w:r>
-            <w:proofErr w:type="spellStart"/>
-            <w:r>
-              <w:rPr>
-                <w:sz w:val="17"/>
-                <w:szCs w:val="17"/>
-              </w:rPr>
-              <w:t>Warsaw</w:t>
-            </w:r>
-            <w:proofErr w:type="spellEnd"/>
-            <w:r>
-              <w:rPr>
-                <w:sz w:val="17"/>
-                <w:szCs w:val="17"/>
-              </w:rPr>
-              <w:t>) - przed AC</w:t>
+              <w:t xml:space="preserve">Projekt przy implementacji; obecny format kwot zostaje</w:t>
             </w:r>
           </w:p>
         </w:tc>
@@ -2529,7 +2733,7 @@
                 <w:sz w:val="17"/>
                 <w:szCs w:val="17"/>
               </w:rPr>
-              <w:t>Format liczb w wyniku (kropka "17333.50 zł" vs. polski "17 333,50 zł").</w:t>
+              <w:t xml:space="preserve">Struktura i liczba testów (dane testowe niezależne od data/orders.json).</w:t>
             </w:r>
           </w:p>
         </w:tc>
@@ -2556,7 +2760,7 @@
                 <w:sz w:val="17"/>
                 <w:szCs w:val="17"/>
               </w:rPr>
-              <w:t>Wpływa na czytelność wyniku na odprawach (pkt 10).</w:t>
+              <w:t xml:space="preserve">Bez tego testy raportu mogą zależeć od danych demo.</w:t>
             </w:r>
           </w:p>
         </w:tc>
@@ -2583,17 +2787,8 @@
                 <w:sz w:val="17"/>
                 <w:szCs w:val="17"/>
               </w:rPr>
-              <w:t xml:space="preserve">Product </w:t>
-            </w:r>
-            <w:proofErr w:type="spellStart"/>
-            <w:r>
-              <w:rPr>
-                <w:sz w:val="17"/>
-                <w:szCs w:val="17"/>
-              </w:rPr>
-              <w:t>Owner</w:t>
-            </w:r>
-            <w:proofErr w:type="spellEnd"/>
+              <w:t xml:space="preserve">Zespół techniczny</w:t>
+            </w:r>
           </w:p>
         </w:tc>
         <w:tc>
@@ -2619,7 +2814,7 @@
                 <w:sz w:val="17"/>
                 <w:szCs w:val="17"/>
               </w:rPr>
-              <w:t>Pytanie na lekcji 4; domyślnie zostaje obecny format</w:t>
+              <w:t xml:space="preserve">Ustalić razem z AC na lekcji 4</w:t>
             </w:r>
           </w:p>
         </w:tc>
@@ -2666,21 +2861,12 @@
         </w:numPr>
         <w:spacing w:after="40"/>
       </w:pPr>
-      <w:proofErr w:type="gramStart"/>
       <w:r>
         <w:rPr>
           <w:sz w:val="18"/>
           <w:szCs w:val="18"/>
         </w:rPr>
-        <w:t>[ ]</w:t>
-      </w:r>
-      <w:proofErr w:type="gramEnd"/>
-      <w:r>
-        <w:rPr>
-          <w:sz w:val="18"/>
-          <w:szCs w:val="18"/>
-        </w:rPr>
-        <w:t xml:space="preserve"> Wymagana korekta przed lekcją 4</w:t>
+        <w:t xml:space="preserve">[ ] Wymagana korekta przed lekcją 4</w:t>
       </w:r>
     </w:p>
     <w:p>
@@ -2707,39 +2893,8 @@
           <w:sz w:val="26"/>
           <w:szCs w:val="26"/>
         </w:rPr>
-        <w:t xml:space="preserve">Materiał wejściowy do User Story i </w:t>
-      </w:r>
-      <w:proofErr w:type="spellStart"/>
-      <w:r>
-        <w:rPr>
-          <w:b/>
-          <w:bCs/>
-          <w:sz w:val="26"/>
-          <w:szCs w:val="26"/>
-        </w:rPr>
-        <w:t>Acceptance</w:t>
-      </w:r>
-      <w:proofErr w:type="spellEnd"/>
-      <w:r>
-        <w:rPr>
-          <w:b/>
-          <w:bCs/>
-          <w:sz w:val="26"/>
-          <w:szCs w:val="26"/>
-        </w:rPr>
-        <w:t xml:space="preserve"> </w:t>
-      </w:r>
-      <w:proofErr w:type="spellStart"/>
-      <w:r>
-        <w:rPr>
-          <w:b/>
-          <w:bCs/>
-          <w:sz w:val="26"/>
-          <w:szCs w:val="26"/>
-        </w:rPr>
-        <w:t>Criteria</w:t>
-      </w:r>
-      <w:proofErr w:type="spellEnd"/>
+        <w:t xml:space="preserve">Materiał wejściowy do User Story i Acceptance Criteria</w:t>
+      </w:r>
     </w:p>
     <w:p>
       <w:pPr>
@@ -2777,7 +2932,7 @@
         <w:spacing w:after="60"/>
       </w:pPr>
       <w:r>
-        <w:t>Reguły do AC: reguły 1-7 z rejestru decyzji.</w:t>
+        <w:t xml:space="preserve">Reguły do AC: reguły 1-9 z rejestru decyzji.</w:t>
       </w:r>
     </w:p>
     <w:p>
@@ -2790,15 +2945,7 @@
         <w:spacing w:after="60"/>
       </w:pPr>
       <w:r>
-        <w:t xml:space="preserve">Przypadki do AC: 1 (dzień), 2 (kampania </w:t>
-      </w:r>
-      <w:proofErr w:type="spellStart"/>
-      <w:r>
-        <w:t>śr-wt</w:t>
-      </w:r>
-      <w:proofErr w:type="spellEnd"/>
-      <w:r>
-        <w:t>), 3 (brak zamówień), 4 (anulowane), 5 (granice), 6 (zły zakres), 7 (miesiąc).</w:t>
+        <w:t xml:space="preserve">Przypadki do AC: 1 (dzień), 2 (kampania śr-wt), 3 (brak zamówień), 4 (anulowane), 5 (granice), 6 (zły zakres), 7 (miesiąc).</w:t>
       </w:r>
     </w:p>
     <w:p>
@@ -2812,11 +2959,6 @@
       </w:pPr>
       <w:r>
         <w:t>Przykład kontrolny z danych demo: maj 2026 (od 2026-05-01 do 2026-05-31) -&gt; 12 zamówień, w tym 1 anulowane (ORD-0006, 388.00 zł); wartość sprzedaży 6114.50 zł; wartość wszystkich 6502.50 zł.</w:t>
-      </w:r>
-    </w:p>
-    <w:p>
-      <w:r>
-        <w:br w:type="page"/>
       </w:r>
     </w:p>
     <w:p>
@@ -2855,29 +2997,7 @@
           <w:szCs w:val="22"/>
           <w:lang w:val="en-US"/>
         </w:rPr>
-        <w:t xml:space="preserve">Exit ticket </w:t>
-      </w:r>
-      <w:proofErr w:type="spellStart"/>
-      <w:r>
-        <w:rPr>
-          <w:b/>
-          <w:bCs/>
-          <w:sz w:val="22"/>
-          <w:szCs w:val="22"/>
-          <w:lang w:val="en-US"/>
-        </w:rPr>
-        <w:t>numer</w:t>
-      </w:r>
-      <w:proofErr w:type="spellEnd"/>
-      <w:r>
-        <w:rPr>
-          <w:b/>
-          <w:bCs/>
-          <w:sz w:val="22"/>
-          <w:szCs w:val="22"/>
-          <w:lang w:val="en-US"/>
-        </w:rPr>
-        <w:t xml:space="preserve"> 1</w:t>
+        <w:t xml:space="preserve">Exit ticket numer 1</w:t>
       </w:r>
     </w:p>
     <w:p>
@@ -2891,9 +3011,21 @@
           <w:sz w:val="18"/>
           <w:szCs w:val="18"/>
         </w:rPr>
-        <w:t xml:space="preserve">1. Która odpowiedź Product </w:t>
-      </w:r>
-      <w:proofErr w:type="spellStart"/>
+        <w:t xml:space="preserve">1. Która odpowiedź Product Ownera najbardziej zmieniła wasze początkowe założenie i dlaczego?</w:t>
+      </w:r>
+    </w:p>
+    <w:p>
+      <w:pPr>
+        <w:spacing w:after="140"/>
+      </w:pPr>
+      <w:r>
+        <w:t xml:space="preserve">Odpowiedź o CANCELLED: zakładałem jedną "łączną wartość" jak w obecnym raporcie, a główną wartością jest wartość sprzedaży bez anulowanych; anulowane widać tylko w podziale na statusy, co zmienia sposób liczenia wyniku.</w:t>
+      </w:r>
+    </w:p>
+    <w:p>
+      <w:pPr>
+        <w:spacing w:after="60"/>
+      </w:pPr>
       <w:r>
         <w:rPr>
           <w:b/>
@@ -2901,17 +3033,7 @@
           <w:sz w:val="18"/>
           <w:szCs w:val="18"/>
         </w:rPr>
-        <w:t>Ownera</w:t>
-      </w:r>
-      <w:proofErr w:type="spellEnd"/>
-      <w:r>
-        <w:rPr>
-          <w:b/>
-          <w:bCs/>
-          <w:sz w:val="18"/>
-          <w:szCs w:val="18"/>
-        </w:rPr>
-        <w:t xml:space="preserve"> najbardziej zmieniła wasze początkowe założenie i dlaczego?</w:t>
+        <w:t xml:space="preserve">2. Która reguła nadal wymaga doprecyzowania przed napisaniem Acceptance Criteria?</w:t>
       </w:r>
     </w:p>
     <w:p>
@@ -2919,85 +3041,7 @@
         <w:spacing w:after="140"/>
       </w:pPr>
       <w:r>
-        <w:t xml:space="preserve">Odpowiedź o CANCELLED: zakładałem jedną "łączną wartość" jak w obecnym raporcie, a raport potrzebuje dwóch wartości - sprzedaży </w:t>
-      </w:r>
-      <w:proofErr w:type="gramStart"/>
-      <w:r>
-        <w:t>bez anulowanych</w:t>
-      </w:r>
-      <w:proofErr w:type="gramEnd"/>
-      <w:r>
-        <w:t xml:space="preserve"> oraz osobno anulowanych - co zmienia sposób liczenia i wygląd wyniku.</w:t>
-      </w:r>
-    </w:p>
-    <w:p>
-      <w:pPr>
-        <w:spacing w:after="60"/>
-      </w:pPr>
-      <w:r>
-        <w:rPr>
-          <w:b/>
-          <w:bCs/>
-          <w:sz w:val="18"/>
-          <w:szCs w:val="18"/>
-        </w:rPr>
-        <w:t xml:space="preserve">2. Która reguła nadal wymaga doprecyzowania przed napisaniem </w:t>
-      </w:r>
-      <w:proofErr w:type="spellStart"/>
-      <w:r>
-        <w:rPr>
-          <w:b/>
-          <w:bCs/>
-          <w:sz w:val="18"/>
-          <w:szCs w:val="18"/>
-        </w:rPr>
-        <w:t>Acceptance</w:t>
-      </w:r>
-      <w:proofErr w:type="spellEnd"/>
-      <w:r>
-        <w:rPr>
-          <w:b/>
-          <w:bCs/>
-          <w:sz w:val="18"/>
-          <w:szCs w:val="18"/>
-        </w:rPr>
-        <w:t xml:space="preserve"> </w:t>
-      </w:r>
-      <w:proofErr w:type="spellStart"/>
-      <w:r>
-        <w:rPr>
-          <w:b/>
-          <w:bCs/>
-          <w:sz w:val="18"/>
-          <w:szCs w:val="18"/>
-        </w:rPr>
-        <w:t>Criteria</w:t>
-      </w:r>
-      <w:proofErr w:type="spellEnd"/>
-      <w:r>
-        <w:rPr>
-          <w:b/>
-          <w:bCs/>
-          <w:sz w:val="18"/>
-          <w:szCs w:val="18"/>
-        </w:rPr>
-        <w:t>?</w:t>
-      </w:r>
-    </w:p>
-    <w:p>
-      <w:pPr>
-        <w:spacing w:after="140"/>
-      </w:pPr>
-      <w:r>
-        <w:t xml:space="preserve">Ograniczenia zakresu dat (data w przyszłości, maksymalna długość okresu) oraz strefa czasu dla </w:t>
-      </w:r>
-      <w:proofErr w:type="spellStart"/>
-      <w:r>
-        <w:t>created_at</w:t>
-      </w:r>
-      <w:proofErr w:type="spellEnd"/>
-      <w:r>
-        <w:t xml:space="preserve"> - bez nich AC dla walidacji i granic dnia nie będą jednoznaczne.</w:t>
+        <w:t xml:space="preserve">Strefa czasu dla created_at i sposób parsowania dat - to decyzje zespołu technicznego, ale bez nich AC dla granic dnia nie będą w pełni jednoznaczne.</w:t>
       </w:r>
     </w:p>
     <w:p>

</xml_diff>